<commit_message>
table added ahead in TT
</commit_message>
<xml_diff>
--- a/TT.docx
+++ b/TT.docx
@@ -2,6 +2,341 @@
 <file path=word/document.xml><?xml version="1.0" encoding="utf-8"?>
 <w:document xmlns:wpc="http://schemas.microsoft.com/office/word/2010/wordprocessingCanvas" xmlns:cx="http://schemas.microsoft.com/office/drawing/2014/chartex" xmlns:cx1="http://schemas.microsoft.com/office/drawing/2015/9/8/chartex" xmlns:cx2="http://schemas.microsoft.com/office/drawing/2015/10/21/chartex" xmlns:cx3="http://schemas.microsoft.com/office/drawing/2016/5/9/chartex" xmlns:cx4="http://schemas.microsoft.com/office/drawing/2016/5/10/chartex" xmlns:cx5="http://schemas.microsoft.com/office/drawing/2016/5/11/chartex" xmlns:cx6="http://schemas.microsoft.com/office/drawing/2016/5/12/chartex" xmlns:cx7="http://schemas.microsoft.com/office/drawing/2016/5/13/chartex" xmlns:cx8="http://schemas.microsoft.com/office/drawing/2016/5/14/chartex" xmlns:mc="http://schemas.openxmlformats.org/markup-compatibility/2006" xmlns:aink="http://schemas.microsoft.com/office/drawing/2016/ink" xmlns:am3d="http://schemas.microsoft.com/office/drawing/2017/model3d" xmlns:o="urn:schemas-microsoft-com:office:office" xmlns:r="http://schemas.openxmlformats.org/officeDocument/2006/relationships" xmlns:m="http://schemas.openxmlformats.org/officeDocument/2006/math" xmlns:v="urn:schemas-microsoft-com:vml" xmlns:wp14="http://schemas.microsoft.com/office/word/2010/wordprocessingDrawing" xmlns:wp="http://schemas.openxmlformats.org/drawingml/2006/wordprocessingDrawing" xmlns:w10="urn:schemas-microsoft-com:office:word" xmlns:w="http://schemas.openxmlformats.org/wordprocessingml/2006/main" xmlns:w14="http://schemas.microsoft.com/office/word/2010/wordml" xmlns:w15="http://schemas.microsoft.com/office/word/2012/wordml" xmlns:w16cex="http://schemas.microsoft.com/office/word/2018/wordml/cex" xmlns:w16cid="http://schemas.microsoft.com/office/word/2016/wordml/cid" xmlns:w16="http://schemas.microsoft.com/office/word/2018/wordml" xmlns:w16se="http://schemas.microsoft.com/office/word/2015/wordml/symex" xmlns:wpg="http://schemas.microsoft.com/office/word/2010/wordprocessingGroup" xmlns:wpi="http://schemas.microsoft.com/office/word/2010/wordprocessingInk" xmlns:wne="http://schemas.microsoft.com/office/word/2006/wordml" xmlns:wps="http://schemas.microsoft.com/office/word/2010/wordprocessingShape" mc:Ignorable="w14 w15 w16se w16cid w16 w16cex wp14">
   <w:body>
+    <w:tbl>
+      <w:tblPr>
+        <w:tblStyle w:val="a4"/>
+        <w:tblW w:w="0" w:type="auto"/>
+        <w:tblLook w:val="04A0" w:firstRow="1" w:lastRow="0" w:firstColumn="1" w:lastColumn="0" w:noHBand="0" w:noVBand="1"/>
+      </w:tblPr>
+      <w:tblGrid>
+        <w:gridCol w:w="1557"/>
+        <w:gridCol w:w="1557"/>
+        <w:gridCol w:w="1557"/>
+        <w:gridCol w:w="1558"/>
+        <w:gridCol w:w="1558"/>
+        <w:gridCol w:w="1558"/>
+      </w:tblGrid>
+      <w:tr>
+        <w:tc>
+          <w:tcPr>
+            <w:tcW w:w="1557" w:type="dxa"/>
+          </w:tcPr>
+          <w:p>
+            <w:pPr>
+              <w:rPr>
+                <w:color w:val="7030A0"/>
+                <w:lang w:val="en-US"/>
+              </w:rPr>
+            </w:pPr>
+          </w:p>
+        </w:tc>
+        <w:tc>
+          <w:tcPr>
+            <w:tcW w:w="1557" w:type="dxa"/>
+          </w:tcPr>
+          <w:p>
+            <w:pPr>
+              <w:rPr>
+                <w:color w:val="7030A0"/>
+                <w:lang w:val="en-US"/>
+              </w:rPr>
+            </w:pPr>
+          </w:p>
+        </w:tc>
+        <w:tc>
+          <w:tcPr>
+            <w:tcW w:w="1557" w:type="dxa"/>
+          </w:tcPr>
+          <w:p>
+            <w:pPr>
+              <w:rPr>
+                <w:color w:val="7030A0"/>
+                <w:lang w:val="en-US"/>
+              </w:rPr>
+            </w:pPr>
+          </w:p>
+        </w:tc>
+        <w:tc>
+          <w:tcPr>
+            <w:tcW w:w="1558" w:type="dxa"/>
+          </w:tcPr>
+          <w:p>
+            <w:pPr>
+              <w:rPr>
+                <w:color w:val="7030A0"/>
+                <w:lang w:val="en-US"/>
+              </w:rPr>
+            </w:pPr>
+          </w:p>
+        </w:tc>
+        <w:tc>
+          <w:tcPr>
+            <w:tcW w:w="1558" w:type="dxa"/>
+          </w:tcPr>
+          <w:p>
+            <w:pPr>
+              <w:rPr>
+                <w:color w:val="7030A0"/>
+                <w:lang w:val="en-US"/>
+              </w:rPr>
+            </w:pPr>
+          </w:p>
+        </w:tc>
+        <w:tc>
+          <w:tcPr>
+            <w:tcW w:w="1558" w:type="dxa"/>
+          </w:tcPr>
+          <w:p>
+            <w:pPr>
+              <w:rPr>
+                <w:color w:val="7030A0"/>
+                <w:lang w:val="en-US"/>
+              </w:rPr>
+            </w:pPr>
+          </w:p>
+        </w:tc>
+      </w:tr>
+      <w:tr>
+        <w:tc>
+          <w:tcPr>
+            <w:tcW w:w="1557" w:type="dxa"/>
+          </w:tcPr>
+          <w:p>
+            <w:pPr>
+              <w:rPr>
+                <w:color w:val="7030A0"/>
+                <w:lang w:val="en-US"/>
+              </w:rPr>
+            </w:pPr>
+          </w:p>
+        </w:tc>
+        <w:tc>
+          <w:tcPr>
+            <w:tcW w:w="1557" w:type="dxa"/>
+          </w:tcPr>
+          <w:p>
+            <w:pPr>
+              <w:rPr>
+                <w:color w:val="7030A0"/>
+                <w:lang w:val="en-US"/>
+              </w:rPr>
+            </w:pPr>
+          </w:p>
+        </w:tc>
+        <w:tc>
+          <w:tcPr>
+            <w:tcW w:w="1557" w:type="dxa"/>
+          </w:tcPr>
+          <w:p>
+            <w:pPr>
+              <w:rPr>
+                <w:color w:val="7030A0"/>
+                <w:lang w:val="en-US"/>
+              </w:rPr>
+            </w:pPr>
+          </w:p>
+        </w:tc>
+        <w:tc>
+          <w:tcPr>
+            <w:tcW w:w="1558" w:type="dxa"/>
+          </w:tcPr>
+          <w:p>
+            <w:pPr>
+              <w:rPr>
+                <w:color w:val="7030A0"/>
+                <w:lang w:val="en-US"/>
+              </w:rPr>
+            </w:pPr>
+          </w:p>
+        </w:tc>
+        <w:tc>
+          <w:tcPr>
+            <w:tcW w:w="1558" w:type="dxa"/>
+          </w:tcPr>
+          <w:p>
+            <w:pPr>
+              <w:rPr>
+                <w:color w:val="7030A0"/>
+                <w:lang w:val="en-US"/>
+              </w:rPr>
+            </w:pPr>
+          </w:p>
+        </w:tc>
+        <w:tc>
+          <w:tcPr>
+            <w:tcW w:w="1558" w:type="dxa"/>
+          </w:tcPr>
+          <w:p>
+            <w:pPr>
+              <w:rPr>
+                <w:color w:val="7030A0"/>
+                <w:lang w:val="en-US"/>
+              </w:rPr>
+            </w:pPr>
+          </w:p>
+        </w:tc>
+      </w:tr>
+      <w:tr>
+        <w:tc>
+          <w:tcPr>
+            <w:tcW w:w="1557" w:type="dxa"/>
+          </w:tcPr>
+          <w:p>
+            <w:pPr>
+              <w:rPr>
+                <w:color w:val="7030A0"/>
+                <w:lang w:val="en-US"/>
+              </w:rPr>
+            </w:pPr>
+          </w:p>
+        </w:tc>
+        <w:tc>
+          <w:tcPr>
+            <w:tcW w:w="1557" w:type="dxa"/>
+          </w:tcPr>
+          <w:p>
+            <w:pPr>
+              <w:rPr>
+                <w:color w:val="7030A0"/>
+                <w:lang w:val="en-US"/>
+              </w:rPr>
+            </w:pPr>
+          </w:p>
+        </w:tc>
+        <w:tc>
+          <w:tcPr>
+            <w:tcW w:w="1557" w:type="dxa"/>
+          </w:tcPr>
+          <w:p>
+            <w:pPr>
+              <w:rPr>
+                <w:color w:val="7030A0"/>
+                <w:lang w:val="en-US"/>
+              </w:rPr>
+            </w:pPr>
+          </w:p>
+        </w:tc>
+        <w:tc>
+          <w:tcPr>
+            <w:tcW w:w="1558" w:type="dxa"/>
+          </w:tcPr>
+          <w:p>
+            <w:pPr>
+              <w:rPr>
+                <w:color w:val="7030A0"/>
+                <w:lang w:val="en-US"/>
+              </w:rPr>
+            </w:pPr>
+          </w:p>
+        </w:tc>
+        <w:tc>
+          <w:tcPr>
+            <w:tcW w:w="1558" w:type="dxa"/>
+          </w:tcPr>
+          <w:p>
+            <w:pPr>
+              <w:rPr>
+                <w:color w:val="7030A0"/>
+                <w:lang w:val="en-US"/>
+              </w:rPr>
+            </w:pPr>
+          </w:p>
+        </w:tc>
+        <w:tc>
+          <w:tcPr>
+            <w:tcW w:w="1558" w:type="dxa"/>
+          </w:tcPr>
+          <w:p>
+            <w:pPr>
+              <w:rPr>
+                <w:color w:val="7030A0"/>
+                <w:lang w:val="en-US"/>
+              </w:rPr>
+            </w:pPr>
+          </w:p>
+        </w:tc>
+      </w:tr>
+      <w:tr>
+        <w:tc>
+          <w:tcPr>
+            <w:tcW w:w="1557" w:type="dxa"/>
+          </w:tcPr>
+          <w:p>
+            <w:pPr>
+              <w:rPr>
+                <w:color w:val="7030A0"/>
+                <w:lang w:val="en-US"/>
+              </w:rPr>
+            </w:pPr>
+          </w:p>
+        </w:tc>
+        <w:tc>
+          <w:tcPr>
+            <w:tcW w:w="1557" w:type="dxa"/>
+          </w:tcPr>
+          <w:p>
+            <w:pPr>
+              <w:rPr>
+                <w:color w:val="7030A0"/>
+                <w:lang w:val="en-US"/>
+              </w:rPr>
+            </w:pPr>
+          </w:p>
+        </w:tc>
+        <w:tc>
+          <w:tcPr>
+            <w:tcW w:w="1557" w:type="dxa"/>
+          </w:tcPr>
+          <w:p>
+            <w:pPr>
+              <w:rPr>
+                <w:color w:val="7030A0"/>
+                <w:lang w:val="en-US"/>
+              </w:rPr>
+            </w:pPr>
+          </w:p>
+        </w:tc>
+        <w:tc>
+          <w:tcPr>
+            <w:tcW w:w="1558" w:type="dxa"/>
+          </w:tcPr>
+          <w:p>
+            <w:pPr>
+              <w:rPr>
+                <w:color w:val="7030A0"/>
+                <w:lang w:val="en-US"/>
+              </w:rPr>
+            </w:pPr>
+          </w:p>
+        </w:tc>
+        <w:tc>
+          <w:tcPr>
+            <w:tcW w:w="1558" w:type="dxa"/>
+          </w:tcPr>
+          <w:p>
+            <w:pPr>
+              <w:rPr>
+                <w:color w:val="7030A0"/>
+                <w:lang w:val="en-US"/>
+              </w:rPr>
+            </w:pPr>
+          </w:p>
+        </w:tc>
+        <w:tc>
+          <w:tcPr>
+            <w:tcW w:w="1558" w:type="dxa"/>
+          </w:tcPr>
+          <w:p>
+            <w:pPr>
+              <w:rPr>
+                <w:color w:val="7030A0"/>
+                <w:lang w:val="en-US"/>
+              </w:rPr>
+            </w:pPr>
+          </w:p>
+        </w:tc>
+      </w:tr>
+    </w:tbl>
     <w:p>
       <w:pPr>
         <w:rPr>
@@ -9,15 +344,33 @@
           <w:lang w:val="en-US"/>
         </w:rPr>
       </w:pPr>
-      <w:r>
+    </w:p>
+    <w:p>
+      <w:pPr>
         <w:rPr>
           <w:color w:val="7030A0"/>
           <w:lang w:val="en-US"/>
         </w:rPr>
-        <w:t>ewqweqwqwqettwq</w:t>
-      </w:r>
+      </w:pPr>
       <w:bookmarkStart w:id="0" w:name="_GoBack"/>
       <w:bookmarkEnd w:id="0"/>
+    </w:p>
+    <w:p>
+      <w:pPr>
+        <w:rPr>
+          <w:color w:val="7030A0"/>
+          <w:lang w:val="en-US"/>
+        </w:rPr>
+      </w:pPr>
+      <w:proofErr w:type="spellStart"/>
+      <w:r>
+        <w:rPr>
+          <w:color w:val="7030A0"/>
+          <w:lang w:val="en-US"/>
+        </w:rPr>
+        <w:t>ewqweqwqwqettwq</w:t>
+      </w:r>
+      <w:proofErr w:type="spellEnd"/>
     </w:p>
     <w:p>
       <w:pPr>
@@ -1749,6 +2102,25 @@
       <w:contextualSpacing/>
     </w:pPr>
   </w:style>
+  <w:style w:type="table" w:styleId="a4">
+    <w:name w:val="Table Grid"/>
+    <w:basedOn w:val="a1"/>
+    <w:uiPriority w:val="39"/>
+    <w:rsid w:val="008F0A7E"/>
+    <w:pPr>
+      <w:spacing w:after="0" w:line="240" w:lineRule="auto"/>
+    </w:pPr>
+    <w:tblPr>
+      <w:tblBorders>
+        <w:top w:val="single" w:sz="4" w:space="0" w:color="auto"/>
+        <w:left w:val="single" w:sz="4" w:space="0" w:color="auto"/>
+        <w:bottom w:val="single" w:sz="4" w:space="0" w:color="auto"/>
+        <w:right w:val="single" w:sz="4" w:space="0" w:color="auto"/>
+        <w:insideH w:val="single" w:sz="4" w:space="0" w:color="auto"/>
+        <w:insideV w:val="single" w:sz="4" w:space="0" w:color="auto"/>
+      </w:tblBorders>
+    </w:tblPr>
+  </w:style>
 </w:styles>
 </file>
 

</xml_diff>

<commit_message>
text added ahead in TT only for feature2
</commit_message>
<xml_diff>
--- a/TT.docx
+++ b/TT.docx
@@ -352,8 +352,22 @@
           <w:lang w:val="en-US"/>
         </w:rPr>
       </w:pPr>
+      <w:r>
+        <w:rPr>
+          <w:color w:val="7030A0"/>
+          <w:lang w:val="en-US"/>
+        </w:rPr>
+        <w:t>Text for</w:t>
+      </w:r>
       <w:bookmarkStart w:id="0" w:name="_GoBack"/>
       <w:bookmarkEnd w:id="0"/>
+      <w:r>
+        <w:rPr>
+          <w:color w:val="7030A0"/>
+          <w:lang w:val="en-US"/>
+        </w:rPr>
+        <w:t xml:space="preserve"> feature2 branch</w:t>
+      </w:r>
     </w:p>
     <w:p>
       <w:pPr>
@@ -362,15 +376,21 @@
           <w:lang w:val="en-US"/>
         </w:rPr>
       </w:pPr>
-      <w:proofErr w:type="spellStart"/>
-      <w:r>
+    </w:p>
+    <w:p>
+      <w:pPr>
         <w:rPr>
           <w:color w:val="7030A0"/>
           <w:lang w:val="en-US"/>
         </w:rPr>
+      </w:pPr>
+      <w:r>
+        <w:rPr>
+          <w:color w:val="7030A0"/>
+          <w:lang w:val="en-US"/>
+        </w:rPr>
         <w:t>ewqweqwqwqettwq</w:t>
       </w:r>
-      <w:proofErr w:type="spellEnd"/>
     </w:p>
     <w:p>
       <w:pPr>
@@ -552,7 +572,6 @@
         </w:rPr>
         <w:t>_+12</w:t>
       </w:r>
-      <w:proofErr w:type="gramStart"/>
       <w:r>
         <w:rPr>
           <w:color w:val="C45911" w:themeColor="accent2" w:themeShade="BF"/>
@@ -567,7 +586,6 @@
         </w:rPr>
         <w:t xml:space="preserve">,   </w:t>
       </w:r>
-      <w:proofErr w:type="gramEnd"/>
       <w:r>
         <w:rPr>
           <w:color w:val="C45911" w:themeColor="accent2" w:themeShade="BF"/>
@@ -666,61 +684,27 @@
         </w:rPr>
         <w:t xml:space="preserve"> (</w:t>
       </w:r>
-      <w:proofErr w:type="spellStart"/>
       <w:r>
         <w:rPr>
           <w:color w:val="C45911" w:themeColor="accent2" w:themeShade="BF"/>
           <w:lang w:val="uk-UA"/>
         </w:rPr>
-        <w:t>контактная</w:t>
-      </w:r>
-      <w:proofErr w:type="spellEnd"/>
+        <w:t>контактная группа реле К3</w:t>
+      </w:r>
+      <w:r>
+        <w:rPr>
+          <w:color w:val="C45911" w:themeColor="accent2" w:themeShade="BF"/>
+          <w:lang w:val="ru-RU"/>
+        </w:rPr>
+        <w:t>)</w:t>
+      </w:r>
       <w:r>
         <w:rPr>
           <w:color w:val="C45911" w:themeColor="accent2" w:themeShade="BF"/>
           <w:lang w:val="uk-UA"/>
         </w:rPr>
-        <w:t xml:space="preserve"> </w:t>
-      </w:r>
-      <w:proofErr w:type="spellStart"/>
-      <w:r>
-        <w:rPr>
-          <w:color w:val="C45911" w:themeColor="accent2" w:themeShade="BF"/>
-          <w:lang w:val="uk-UA"/>
-        </w:rPr>
-        <w:t>группа</w:t>
-      </w:r>
-      <w:proofErr w:type="spellEnd"/>
-      <w:r>
-        <w:rPr>
-          <w:color w:val="C45911" w:themeColor="accent2" w:themeShade="BF"/>
-          <w:lang w:val="uk-UA"/>
-        </w:rPr>
-        <w:t xml:space="preserve"> реле К3</w:t>
-      </w:r>
-      <w:r>
-        <w:rPr>
-          <w:color w:val="C45911" w:themeColor="accent2" w:themeShade="BF"/>
-          <w:lang w:val="ru-RU"/>
-        </w:rPr>
-        <w:t>)</w:t>
-      </w:r>
-      <w:r>
-        <w:rPr>
-          <w:color w:val="C45911" w:themeColor="accent2" w:themeShade="BF"/>
-          <w:lang w:val="uk-UA"/>
-        </w:rPr>
-        <w:t xml:space="preserve"> </w:t>
-      </w:r>
-      <w:proofErr w:type="spellStart"/>
-      <w:r>
-        <w:rPr>
-          <w:color w:val="C45911" w:themeColor="accent2" w:themeShade="BF"/>
-          <w:lang w:val="uk-UA"/>
-        </w:rPr>
-        <w:t>должн</w:t>
-      </w:r>
-      <w:proofErr w:type="spellEnd"/>
+        <w:t xml:space="preserve"> должн</w:t>
+      </w:r>
       <w:r>
         <w:rPr>
           <w:color w:val="C45911" w:themeColor="accent2" w:themeShade="BF"/>
@@ -769,7 +753,6 @@
         </w:rPr>
         <w:t>_</w:t>
       </w:r>
-      <w:proofErr w:type="spellStart"/>
       <w:r>
         <w:rPr>
           <w:color w:val="C45911" w:themeColor="accent2" w:themeShade="BF"/>
@@ -777,7 +760,6 @@
         </w:rPr>
         <w:t>zovn</w:t>
       </w:r>
-      <w:proofErr w:type="spellEnd"/>
       <w:r>
         <w:rPr>
           <w:color w:val="C45911" w:themeColor="accent2" w:themeShade="BF"/>
@@ -813,7 +795,6 @@
         </w:rPr>
         <w:t xml:space="preserve">, </w:t>
       </w:r>
-      <w:proofErr w:type="spellStart"/>
       <w:r>
         <w:rPr>
           <w:color w:val="C45911" w:themeColor="accent2" w:themeShade="BF"/>
@@ -821,7 +802,6 @@
         </w:rPr>
         <w:t>ZhivlTRD</w:t>
       </w:r>
-      <w:proofErr w:type="spellEnd"/>
       <w:r>
         <w:rPr>
           <w:color w:val="C45911" w:themeColor="accent2" w:themeShade="BF"/>
@@ -885,7 +865,6 @@
         </w:rPr>
         <w:t>_</w:t>
       </w:r>
-      <w:proofErr w:type="spellStart"/>
       <w:r>
         <w:rPr>
           <w:color w:val="C45911" w:themeColor="accent2" w:themeShade="BF"/>
@@ -893,7 +872,6 @@
         </w:rPr>
         <w:t>zovn</w:t>
       </w:r>
-      <w:proofErr w:type="spellEnd"/>
       <w:r>
         <w:rPr>
           <w:color w:val="C45911" w:themeColor="accent2" w:themeShade="BF"/>
@@ -929,68 +907,34 @@
         </w:rPr>
         <w:t xml:space="preserve"> (</w:t>
       </w:r>
-      <w:proofErr w:type="spellStart"/>
       <w:r>
         <w:rPr>
           <w:color w:val="C45911" w:themeColor="accent2" w:themeShade="BF"/>
           <w:lang w:val="uk-UA"/>
         </w:rPr>
-        <w:t>контактная</w:t>
-      </w:r>
-      <w:proofErr w:type="spellEnd"/>
+        <w:t xml:space="preserve">контактная группа реле </w:t>
+      </w:r>
+      <w:r>
+        <w:rPr>
+          <w:color w:val="C45911" w:themeColor="accent2" w:themeShade="BF"/>
+          <w:lang w:val="en-US"/>
+        </w:rPr>
+        <w:t>SA</w:t>
+      </w:r>
+      <w:r>
+        <w:rPr>
+          <w:color w:val="C45911" w:themeColor="accent2" w:themeShade="BF"/>
+          <w:lang w:val="ru-RU"/>
+        </w:rPr>
+        <w:t>1)</w:t>
+      </w:r>
       <w:r>
         <w:rPr>
           <w:color w:val="C45911" w:themeColor="accent2" w:themeShade="BF"/>
           <w:lang w:val="uk-UA"/>
         </w:rPr>
-        <w:t xml:space="preserve"> </w:t>
-      </w:r>
-      <w:proofErr w:type="spellStart"/>
-      <w:r>
-        <w:rPr>
-          <w:color w:val="C45911" w:themeColor="accent2" w:themeShade="BF"/>
-          <w:lang w:val="uk-UA"/>
-        </w:rPr>
-        <w:t>группа</w:t>
-      </w:r>
-      <w:proofErr w:type="spellEnd"/>
-      <w:r>
-        <w:rPr>
-          <w:color w:val="C45911" w:themeColor="accent2" w:themeShade="BF"/>
-          <w:lang w:val="uk-UA"/>
-        </w:rPr>
-        <w:t xml:space="preserve"> реле </w:t>
-      </w:r>
-      <w:r>
-        <w:rPr>
-          <w:color w:val="C45911" w:themeColor="accent2" w:themeShade="BF"/>
-          <w:lang w:val="en-US"/>
-        </w:rPr>
-        <w:t>SA</w:t>
-      </w:r>
-      <w:r>
-        <w:rPr>
-          <w:color w:val="C45911" w:themeColor="accent2" w:themeShade="BF"/>
-          <w:lang w:val="ru-RU"/>
-        </w:rPr>
-        <w:t>1)</w:t>
-      </w:r>
-      <w:r>
-        <w:rPr>
-          <w:color w:val="C45911" w:themeColor="accent2" w:themeShade="BF"/>
-          <w:lang w:val="uk-UA"/>
-        </w:rPr>
-        <w:t xml:space="preserve"> </w:t>
-      </w:r>
-      <w:proofErr w:type="spellStart"/>
-      <w:r>
-        <w:rPr>
-          <w:color w:val="C45911" w:themeColor="accent2" w:themeShade="BF"/>
-          <w:lang w:val="uk-UA"/>
-        </w:rPr>
-        <w:t>должн</w:t>
-      </w:r>
-      <w:proofErr w:type="spellEnd"/>
+        <w:t xml:space="preserve"> должн</w:t>
+      </w:r>
       <w:r>
         <w:rPr>
           <w:color w:val="C45911" w:themeColor="accent2" w:themeShade="BF"/>
@@ -1109,7 +1053,6 @@
         </w:rPr>
         <w:t xml:space="preserve">  (</w:t>
       </w:r>
-      <w:proofErr w:type="spellStart"/>
       <w:r>
         <w:rPr>
           <w:color w:val="C45911" w:themeColor="accent2" w:themeShade="BF"/>
@@ -1124,74 +1067,55 @@
         </w:rPr>
         <w:t>ые</w:t>
       </w:r>
-      <w:proofErr w:type="spellEnd"/>
       <w:r>
         <w:rPr>
           <w:color w:val="C45911" w:themeColor="accent2" w:themeShade="BF"/>
           <w:lang w:val="uk-UA"/>
         </w:rPr>
-        <w:t xml:space="preserve"> </w:t>
-      </w:r>
-      <w:proofErr w:type="spellStart"/>
+        <w:t xml:space="preserve"> групп</w:t>
+      </w:r>
       <w:r>
         <w:rPr>
           <w:color w:val="C45911" w:themeColor="accent2" w:themeShade="BF"/>
           <w:lang w:val="uk-UA"/>
         </w:rPr>
-        <w:t>групп</w:t>
+        <w:t>ы</w:t>
       </w:r>
       <w:r>
         <w:rPr>
           <w:color w:val="C45911" w:themeColor="accent2" w:themeShade="BF"/>
           <w:lang w:val="uk-UA"/>
         </w:rPr>
-        <w:t>ы</w:t>
-      </w:r>
-      <w:proofErr w:type="spellEnd"/>
+        <w:t xml:space="preserve"> реле </w:t>
+      </w:r>
       <w:r>
         <w:rPr>
           <w:color w:val="C45911" w:themeColor="accent2" w:themeShade="BF"/>
           <w:lang w:val="uk-UA"/>
         </w:rPr>
-        <w:t xml:space="preserve"> реле </w:t>
+        <w:t>К</w:t>
+      </w:r>
+      <w:r>
+        <w:rPr>
+          <w:color w:val="C45911" w:themeColor="accent2" w:themeShade="BF"/>
+          <w:lang w:val="ru-RU"/>
+        </w:rPr>
+        <w:t>1, К2</w:t>
+      </w:r>
+      <w:r>
+        <w:rPr>
+          <w:color w:val="C45911" w:themeColor="accent2" w:themeShade="BF"/>
+          <w:lang w:val="ru-RU"/>
+        </w:rPr>
+        <w:t>)</w:t>
       </w:r>
       <w:r>
         <w:rPr>
           <w:color w:val="C45911" w:themeColor="accent2" w:themeShade="BF"/>
           <w:lang w:val="uk-UA"/>
         </w:rPr>
-        <w:t>К</w:t>
-      </w:r>
-      <w:r>
-        <w:rPr>
-          <w:color w:val="C45911" w:themeColor="accent2" w:themeShade="BF"/>
-          <w:lang w:val="ru-RU"/>
-        </w:rPr>
-        <w:t>1, К2</w:t>
-      </w:r>
-      <w:r>
-        <w:rPr>
-          <w:color w:val="C45911" w:themeColor="accent2" w:themeShade="BF"/>
-          <w:lang w:val="ru-RU"/>
-        </w:rPr>
-        <w:t>)</w:t>
-      </w:r>
-      <w:r>
-        <w:rPr>
-          <w:color w:val="C45911" w:themeColor="accent2" w:themeShade="BF"/>
-          <w:lang w:val="uk-UA"/>
-        </w:rPr>
-        <w:t xml:space="preserve"> </w:t>
-      </w:r>
-      <w:proofErr w:type="spellStart"/>
-      <w:r>
-        <w:rPr>
-          <w:color w:val="C45911" w:themeColor="accent2" w:themeShade="BF"/>
-          <w:lang w:val="uk-UA"/>
-        </w:rPr>
-        <w:t>должн</w:t>
-      </w:r>
-      <w:proofErr w:type="spellEnd"/>
+        <w:t xml:space="preserve"> должн</w:t>
+      </w:r>
       <w:r>
         <w:rPr>
           <w:color w:val="C45911" w:themeColor="accent2" w:themeShade="BF"/>
@@ -1213,14 +1137,12 @@
         </w:rPr>
         <w:t xml:space="preserve">Элементы на листе </w:t>
       </w:r>
-      <w:proofErr w:type="spellStart"/>
       <w:r>
         <w:rPr>
           <w:lang w:val="en-US"/>
         </w:rPr>
         <w:t>UltraBUKEthernet</w:t>
       </w:r>
-      <w:proofErr w:type="spellEnd"/>
       <w:r>
         <w:rPr>
           <w:lang w:val="ru-RU"/>
@@ -1239,33 +1161,11 @@
         </w:rPr>
         <w:t xml:space="preserve">. </w:t>
       </w:r>
-      <w:proofErr w:type="spellStart"/>
       <w:r>
         <w:rPr>
           <w:lang w:val="uk-UA"/>
         </w:rPr>
-        <w:t>Расположить</w:t>
-      </w:r>
-      <w:proofErr w:type="spellEnd"/>
-      <w:r>
-        <w:rPr>
-          <w:lang w:val="uk-UA"/>
-        </w:rPr>
-        <w:t xml:space="preserve"> </w:t>
-      </w:r>
-      <w:proofErr w:type="spellStart"/>
-      <w:r>
-        <w:rPr>
-          <w:lang w:val="uk-UA"/>
-        </w:rPr>
-        <w:t>вместе</w:t>
-      </w:r>
-      <w:proofErr w:type="spellEnd"/>
-      <w:r>
-        <w:rPr>
-          <w:lang w:val="uk-UA"/>
-        </w:rPr>
-        <w:t xml:space="preserve"> </w:t>
+        <w:t xml:space="preserve">Расположить вместе </w:t>
       </w:r>
       <w:r>
         <w:rPr>
@@ -1364,137 +1264,31 @@
         <w:rPr>
           <w:lang w:val="uk-UA"/>
         </w:rPr>
-        <w:t xml:space="preserve">не </w:t>
-      </w:r>
-      <w:proofErr w:type="spellStart"/>
+        <w:t>не менее 0.5мм</w:t>
+      </w:r>
       <w:r>
         <w:rPr>
           <w:lang w:val="uk-UA"/>
         </w:rPr>
-        <w:t>менее</w:t>
-      </w:r>
-      <w:proofErr w:type="spellEnd"/>
+        <w:t>)</w:t>
+      </w:r>
       <w:r>
         <w:rPr>
           <w:lang w:val="uk-UA"/>
         </w:rPr>
-        <w:t xml:space="preserve"> 0.5мм</w:t>
+        <w:t xml:space="preserve">. </w:t>
       </w:r>
       <w:r>
         <w:rPr>
           <w:lang w:val="uk-UA"/>
         </w:rPr>
-        <w:t>)</w:t>
+        <w:t xml:space="preserve"> </w:t>
       </w:r>
       <w:r>
         <w:rPr>
           <w:lang w:val="uk-UA"/>
         </w:rPr>
-        <w:t xml:space="preserve">. </w:t>
-      </w:r>
-      <w:r>
-        <w:rPr>
-          <w:lang w:val="uk-UA"/>
-        </w:rPr>
-        <w:t xml:space="preserve"> </w:t>
-      </w:r>
-      <w:proofErr w:type="spellStart"/>
-      <w:r>
-        <w:rPr>
-          <w:lang w:val="uk-UA"/>
-        </w:rPr>
-        <w:t>Свободное</w:t>
-      </w:r>
-      <w:proofErr w:type="spellEnd"/>
-      <w:r>
-        <w:rPr>
-          <w:lang w:val="uk-UA"/>
-        </w:rPr>
-        <w:t xml:space="preserve"> </w:t>
-      </w:r>
-      <w:proofErr w:type="spellStart"/>
-      <w:r>
-        <w:rPr>
-          <w:lang w:val="uk-UA"/>
-        </w:rPr>
-        <w:t>место</w:t>
-      </w:r>
-      <w:proofErr w:type="spellEnd"/>
-      <w:r>
-        <w:rPr>
-          <w:lang w:val="uk-UA"/>
-        </w:rPr>
-        <w:t xml:space="preserve"> на </w:t>
-      </w:r>
-      <w:proofErr w:type="spellStart"/>
-      <w:r>
-        <w:rPr>
-          <w:lang w:val="uk-UA"/>
-        </w:rPr>
-        <w:t>плате</w:t>
-      </w:r>
-      <w:proofErr w:type="spellEnd"/>
-      <w:r>
-        <w:rPr>
-          <w:lang w:val="uk-UA"/>
-        </w:rPr>
-        <w:t xml:space="preserve"> – </w:t>
-      </w:r>
-      <w:proofErr w:type="spellStart"/>
-      <w:r>
-        <w:rPr>
-          <w:lang w:val="uk-UA"/>
-        </w:rPr>
-        <w:t>заполнить</w:t>
-      </w:r>
-      <w:proofErr w:type="spellEnd"/>
-      <w:r>
-        <w:rPr>
-          <w:lang w:val="uk-UA"/>
-        </w:rPr>
-        <w:t xml:space="preserve"> </w:t>
-      </w:r>
-      <w:proofErr w:type="spellStart"/>
-      <w:r>
-        <w:rPr>
-          <w:lang w:val="uk-UA"/>
-        </w:rPr>
-        <w:t>заливкой</w:t>
-      </w:r>
-      <w:proofErr w:type="spellEnd"/>
-      <w:r>
-        <w:rPr>
-          <w:lang w:val="uk-UA"/>
-        </w:rPr>
-        <w:t xml:space="preserve">, </w:t>
-      </w:r>
-      <w:proofErr w:type="spellStart"/>
-      <w:r>
-        <w:rPr>
-          <w:lang w:val="uk-UA"/>
-        </w:rPr>
-        <w:t>связанной</w:t>
-      </w:r>
-      <w:proofErr w:type="spellEnd"/>
-      <w:r>
-        <w:rPr>
-          <w:lang w:val="uk-UA"/>
-        </w:rPr>
-        <w:t xml:space="preserve"> с </w:t>
-      </w:r>
-      <w:proofErr w:type="spellStart"/>
-      <w:r>
-        <w:rPr>
-          <w:lang w:val="uk-UA"/>
-        </w:rPr>
-        <w:t>цепью</w:t>
-      </w:r>
-      <w:proofErr w:type="spellEnd"/>
-      <w:r>
-        <w:rPr>
-          <w:lang w:val="uk-UA"/>
-        </w:rPr>
-        <w:t xml:space="preserve"> </w:t>
+        <w:t xml:space="preserve">Свободное место на плате – заполнить заливкой, связанной с цепью </w:t>
       </w:r>
       <w:r>
         <w:rPr>
@@ -1520,21 +1314,7 @@
           <w:lang w:val="ru-RU"/>
         </w:rPr>
         <w:tab/>
-        <w:t xml:space="preserve">Разделительные конденсаторы </w:t>
-      </w:r>
-      <w:proofErr w:type="gramStart"/>
-      <w:r>
-        <w:rPr>
-          <w:lang w:val="ru-RU"/>
-        </w:rPr>
-        <w:t>питания  –</w:t>
-      </w:r>
-      <w:proofErr w:type="gramEnd"/>
-      <w:r>
-        <w:rPr>
-          <w:lang w:val="ru-RU"/>
-        </w:rPr>
-        <w:t xml:space="preserve"> около выводов питания микроконтроллера. Максимально близко.</w:t>
+        <w:t>Разделительные конденсаторы питания  – около выводов питания микроконтроллера. Максимально близко.</w:t>
       </w:r>
     </w:p>
     <w:p>

</xml_diff>